<commit_message>
Added SRS and map editor
</commit_message>
<xml_diff>
--- a/Documentation/SRS.docx
+++ b/Documentation/SRS.docx
@@ -54,11 +54,21 @@
         <w:ind w:firstLine="720"/>
       </w:pPr>
       <w:r>
-        <w:t xml:space="preserve">2.1 Project Features </w:t>
-      </w:r>
-    </w:p>
-    <w:p>
-      <w:r>
+        <w:t xml:space="preserve">2.1 </w:t>
+      </w:r>
+      <w:r>
+        <w:t>Stakeholder Requirements</w:t>
+      </w:r>
+      <w:r>
+        <w:t xml:space="preserve"> </w:t>
+      </w:r>
+    </w:p>
+    <w:p>
+      <w:pPr>
+        <w:ind w:firstLine="720"/>
+      </w:pPr>
+      <w:r>
+        <w:rPr/>
         <w:t xml:space="preserve">2.2 User Stories </w:t>
       </w:r>
     </w:p>
@@ -101,19 +111,12 @@
         <w:t xml:space="preserve"> </w:t>
       </w:r>
     </w:p>
-    <w:p/>
-    <w:p/>
-    <w:p/>
-    <w:p/>
-    <w:p/>
-    <w:p/>
-    <w:p/>
-    <w:p/>
-    <w:p/>
-    <w:p/>
-    <w:p/>
-    <w:p/>
-    <w:p/>
+    <w:p>
+      <w:r>
+        <w:rPr/>
+        <w:t>------------------------------------------------------------------------------------------------------------------</w:t>
+      </w:r>
+    </w:p>
     <w:p>
       <w:r>
         <w:t xml:space="preserve">1. </w:t>
@@ -141,312 +144,137 @@
       </w:r>
     </w:p>
     <w:p>
+      <w:r>
+        <w:tab/>
+      </w:r>
+      <w:r>
+        <w:t xml:space="preserve">SR-: </w:t>
+      </w:r>
+      <w:r>
+        <w:t>Stakeholders expect the game server to remain available and maintain stable connections.</w:t>
+      </w:r>
+    </w:p>
+    <w:p>
+      <w:pPr>
+        <w:ind w:firstLine="720"/>
+      </w:pPr>
+      <w:r>
+        <w:t xml:space="preserve">SR-: </w:t>
+      </w:r>
+      <w:r>
+        <w:t>Stakeholders need player data (position, identity, state) to sync reliably across clients.</w:t>
+      </w:r>
+    </w:p>
+    <w:p>
+      <w:pPr>
+        <w:ind w:firstLine="720"/>
+      </w:pPr>
+      <w:r>
+        <w:t xml:space="preserve">SR-: </w:t>
+      </w:r>
+      <w:r>
+        <w:t>Players need the game to provide fast-paced, short sessions that are easy to join and replay.</w:t>
+      </w:r>
+    </w:p>
+    <w:p>
+      <w:pPr>
+        <w:ind w:firstLine="720"/>
+      </w:pPr>
+      <w:r>
+        <w:t xml:space="preserve">SR-: </w:t>
+      </w:r>
+      <w:r>
+        <w:t>Players expect the infection game mode to be clear, fair, and consistent.</w:t>
+      </w:r>
+    </w:p>
+    <w:p>
+      <w:pPr>
+        <w:ind w:firstLine="720"/>
+      </w:pPr>
+      <w:r>
+        <w:rPr/>
+        <w:t xml:space="preserve">SR-: </w:t>
+      </w:r>
+      <w:r>
+        <w:rPr/>
+        <w:t>Players want other players’ positions and actions to appear smooth and responsive during multiplayer gameplay.</w:t>
+      </w:r>
+    </w:p>
+    <w:p>
+      <w:pPr>
+        <w:ind w:firstLine="720"/>
+      </w:pPr>
+    </w:p>
+    <w:p>
+      <w:r>
+        <w:t>2.2 User Stories</w:t>
+      </w:r>
+    </w:p>
+    <w:p>
       <w:pPr>
         <w:pStyle w:val="ListParagraph"/>
-        <w:ind w:left="1080"/>
-      </w:pPr>
+      </w:pPr>
+      <w:r>
+        <w:t>US-01 As a player, I want matches to last around 5–10 minutes so that the game feels fast-paced and doesn’t get repetitive.</w:t>
+      </w:r>
     </w:p>
     <w:p>
       <w:pPr>
         <w:pStyle w:val="ListParagraph"/>
-        <w:ind w:left="1080"/>
       </w:pPr>
     </w:p>
     <w:p>
       <w:pPr>
         <w:pStyle w:val="ListParagraph"/>
-        <w:ind w:left="1080"/>
-      </w:pPr>
+      </w:pPr>
+      <w:r>
+        <w:t>US-02 As a runner, I want movement-based power-ups like speed boosts or dashes so that I can escape infected players more effectively.</w:t>
+      </w:r>
     </w:p>
     <w:p>
       <w:pPr>
         <w:pStyle w:val="ListParagraph"/>
-        <w:ind w:left="1080"/>
       </w:pPr>
     </w:p>
     <w:p>
       <w:pPr>
         <w:pStyle w:val="ListParagraph"/>
-        <w:ind w:left="1080"/>
-      </w:pPr>
+      </w:pPr>
+      <w:r>
+        <w:t>US-03 As an infected player, I want stealth or disguise abilities so that I can approach runners without being easily detected.</w:t>
+      </w:r>
     </w:p>
     <w:p>
       <w:pPr>
         <w:pStyle w:val="ListParagraph"/>
-        <w:ind w:left="1080"/>
       </w:pPr>
     </w:p>
     <w:p>
       <w:pPr>
         <w:pStyle w:val="ListParagraph"/>
-        <w:ind w:left="1080"/>
-      </w:pPr>
+      </w:pPr>
+      <w:r>
+        <w:t>US-05 As a player, I want counterplay abilities (e.g., cures, stuns) so that there are multiple strategic options during a match.</w:t>
+      </w:r>
     </w:p>
     <w:p>
       <w:pPr>
         <w:pStyle w:val="ListParagraph"/>
-        <w:ind w:left="1080"/>
       </w:pPr>
     </w:p>
     <w:p>
       <w:pPr>
         <w:pStyle w:val="ListParagraph"/>
-        <w:ind w:left="1080"/>
-      </w:pPr>
+      </w:pPr>
+      <w:r>
+        <w:t>US-06 As a player, I want power-ups to be balanced so that neither side becomes overpowered.</w:t>
+      </w:r>
     </w:p>
     <w:p>
       <w:pPr>
         <w:pStyle w:val="ListParagraph"/>
-        <w:ind w:left="1080"/>
-      </w:pPr>
-    </w:p>
-    <w:p>
-      <w:pPr>
-        <w:pStyle w:val="ListParagraph"/>
-        <w:ind w:left="1080"/>
-      </w:pPr>
-    </w:p>
-    <w:p>
-      <w:pPr>
-        <w:pStyle w:val="ListParagraph"/>
-        <w:ind w:left="1080"/>
-      </w:pPr>
-    </w:p>
-    <w:p>
-      <w:pPr>
-        <w:pStyle w:val="ListParagraph"/>
-        <w:ind w:left="1080"/>
-      </w:pPr>
-    </w:p>
-    <w:p>
-      <w:pPr>
-        <w:pStyle w:val="ListParagraph"/>
-        <w:ind w:left="1080"/>
-      </w:pPr>
-    </w:p>
-    <w:p>
-      <w:pPr>
-        <w:pStyle w:val="ListParagraph"/>
-        <w:ind w:left="1080"/>
-      </w:pPr>
-    </w:p>
-    <w:p>
-      <w:pPr>
-        <w:pStyle w:val="ListParagraph"/>
-        <w:ind w:left="1080"/>
-      </w:pPr>
-    </w:p>
-    <w:p>
-      <w:pPr>
-        <w:pStyle w:val="ListParagraph"/>
-        <w:ind w:left="1080"/>
-      </w:pPr>
-    </w:p>
-    <w:p>
-      <w:pPr>
-        <w:pStyle w:val="ListParagraph"/>
-        <w:ind w:left="1080"/>
-      </w:pPr>
-    </w:p>
-    <w:p>
-      <w:pPr>
-        <w:pStyle w:val="ListParagraph"/>
-        <w:ind w:left="1080"/>
-      </w:pPr>
-    </w:p>
-    <w:p>
-      <w:pPr>
-        <w:pStyle w:val="ListParagraph"/>
-        <w:ind w:left="1080"/>
-      </w:pPr>
-    </w:p>
-    <w:p>
-      <w:pPr>
-        <w:pStyle w:val="ListParagraph"/>
-        <w:ind w:left="1080"/>
-      </w:pPr>
-    </w:p>
-    <w:p>
-      <w:pPr>
-        <w:pStyle w:val="ListParagraph"/>
-        <w:ind w:left="1080"/>
-      </w:pPr>
-    </w:p>
-    <w:p>
-      <w:pPr>
-        <w:pStyle w:val="ListParagraph"/>
-        <w:ind w:left="1080"/>
-      </w:pPr>
-    </w:p>
-    <w:p>
-      <w:pPr>
-        <w:pStyle w:val="ListParagraph"/>
-        <w:ind w:left="1080"/>
-      </w:pPr>
-    </w:p>
-    <w:p>
-      <w:pPr>
-        <w:pStyle w:val="ListParagraph"/>
-        <w:ind w:left="1080"/>
-      </w:pPr>
-    </w:p>
-    <w:p>
-      <w:pPr>
-        <w:pStyle w:val="ListParagraph"/>
-        <w:ind w:left="1080"/>
-      </w:pPr>
-    </w:p>
-    <w:p>
-      <w:pPr>
-        <w:pStyle w:val="ListParagraph"/>
-        <w:ind w:left="1080"/>
-      </w:pPr>
-    </w:p>
-    <w:p>
-      <w:pPr>
-        <w:pStyle w:val="ListParagraph"/>
-        <w:ind w:left="1080"/>
-      </w:pPr>
-    </w:p>
-    <w:p>
-      <w:pPr>
-        <w:pStyle w:val="ListParagraph"/>
-        <w:ind w:left="1080"/>
-      </w:pPr>
-    </w:p>
-    <w:p>
-      <w:pPr>
-        <w:pStyle w:val="ListParagraph"/>
-        <w:ind w:left="1080"/>
-      </w:pPr>
-    </w:p>
-    <w:p>
-      <w:pPr>
-        <w:pStyle w:val="ListParagraph"/>
-        <w:ind w:left="1080"/>
-      </w:pPr>
-    </w:p>
-    <w:p>
-      <w:pPr>
-        <w:pStyle w:val="ListParagraph"/>
-        <w:ind w:left="1080"/>
-      </w:pPr>
-    </w:p>
-    <w:p>
-      <w:pPr>
-        <w:pStyle w:val="ListParagraph"/>
-        <w:ind w:left="1080"/>
-      </w:pPr>
-    </w:p>
-    <w:p>
-      <w:pPr>
-        <w:pStyle w:val="ListParagraph"/>
-        <w:ind w:left="1080"/>
-      </w:pPr>
-    </w:p>
-    <w:p>
-      <w:pPr>
-        <w:pStyle w:val="ListParagraph"/>
-        <w:ind w:left="1080"/>
-      </w:pPr>
-    </w:p>
-    <w:p>
-      <w:pPr>
-        <w:ind w:left="1080"/>
-      </w:pPr>
-    </w:p>
-    <w:p>
-      <w:r>
-        <w:t>2.2 User Stories</w:t>
-      </w:r>
-    </w:p>
-    <w:p>
-      <w:pPr>
-        <w:pStyle w:val="ListParagraph"/>
-      </w:pPr>
-      <w:r>
-        <w:t>US-01 As a player, I want matches to last around 5–10 minutes so that the game feels fast-paced and doesn’t get repetitive.</w:t>
-      </w:r>
-    </w:p>
-    <w:p>
-      <w:pPr>
-        <w:pStyle w:val="ListParagraph"/>
-      </w:pPr>
-    </w:p>
-    <w:p>
-      <w:pPr>
-        <w:pStyle w:val="ListParagraph"/>
-      </w:pPr>
-      <w:r>
-        <w:t>US-02 As a runner, I want movement-based power-ups like speed boosts or dashes so that I can escape infected players more effectively.</w:t>
-      </w:r>
-    </w:p>
-    <w:p>
-      <w:pPr>
-        <w:pStyle w:val="ListParagraph"/>
-      </w:pPr>
-    </w:p>
-    <w:p>
-      <w:pPr>
-        <w:pStyle w:val="ListParagraph"/>
-      </w:pPr>
-      <w:r>
-        <w:t>US-03 As an infected player, I want stealth or disguise abilities so that I can approach runners without being easily detected.</w:t>
-      </w:r>
-    </w:p>
-    <w:p>
-      <w:pPr>
-        <w:pStyle w:val="ListParagraph"/>
-      </w:pPr>
-    </w:p>
-    <w:p>
-      <w:pPr>
-        <w:pStyle w:val="ListParagraph"/>
-      </w:pPr>
-      <w:r>
-        <w:t>US-05 As a player, I want counterplay abilities (e.g., cures, stuns) so that there are multiple strategic options during a match.</w:t>
-      </w:r>
-    </w:p>
-    <w:p>
-      <w:pPr>
-        <w:pStyle w:val="ListParagraph"/>
-      </w:pPr>
-    </w:p>
-    <w:p>
-      <w:pPr>
-        <w:pStyle w:val="ListParagraph"/>
-      </w:pPr>
-      <w:r>
-        <w:t>US-06 As a player, I want power-ups to be balanced so that neither side becomes overpowered.</w:t>
-      </w:r>
-    </w:p>
-    <w:p>
-      <w:pPr>
-        <w:pStyle w:val="ListParagraph"/>
-      </w:pPr>
-    </w:p>
-    <w:p>
-      <w:pPr>
-        <w:pStyle w:val="ListParagraph"/>
-      </w:pPr>
-    </w:p>
-    <w:p>
-      <w:pPr>
-        <w:pStyle w:val="ListParagraph"/>
-      </w:pPr>
-    </w:p>
-    <w:p>
-      <w:pPr>
-        <w:pStyle w:val="ListParagraph"/>
-      </w:pPr>
-    </w:p>
-    <w:p>
-      <w:pPr>
-        <w:ind w:firstLine="720"/>
-      </w:pPr>
-    </w:p>
-    <w:p/>
-    <w:p/>
+      </w:pPr>
+    </w:p>
     <w:p>
       <w:r>
         <w:t xml:space="preserve">3. System Requirements  </w:t>
@@ -462,42 +290,59 @@
         <w:ind w:left="720"/>
       </w:pPr>
       <w:r>
-        <w:t xml:space="preserve">FR-01: When a player joins a lobby, the system shall assign them a unique player </w:t>
-      </w:r>
-      <w:r>
-        <w:tab/>
-        <w:t xml:space="preserve">ID and initial team state </w:t>
+        <w:t>FR-: The system shall manage scene creation, loading, and destruction using a centralized scene manager.</w:t>
       </w:r>
     </w:p>
     <w:p>
       <w:pPr>
         <w:ind w:left="720"/>
       </w:pPr>
+      <w:r>
+        <w:t xml:space="preserve">FR-: The system </w:t>
+      </w:r>
+      <w:proofErr w:type="gramStart"/>
+      <w:r>
+        <w:t>shall</w:t>
+      </w:r>
+      <w:proofErr w:type="gramEnd"/>
+      <w:r>
+        <w:t xml:space="preserve"> ensure that only the active scene is rendered and receives input.</w:t>
+      </w:r>
     </w:p>
     <w:p>
       <w:pPr>
         <w:ind w:left="720"/>
       </w:pPr>
       <w:r>
+        <w:t xml:space="preserve">FR-: When the game starts, the </w:t>
+      </w:r>
+      <w:proofErr w:type="gramStart"/>
+      <w:r>
+        <w:t>system shall</w:t>
+      </w:r>
+      <w:proofErr w:type="gramEnd"/>
+      <w:r>
+        <w:t xml:space="preserve"> display a main menu containing the</w:t>
+      </w:r>
+      <w:r>
         <w:t xml:space="preserve"> </w:t>
       </w:r>
+      <w:r>
+        <w:t>title and available actions.</w:t>
+      </w:r>
     </w:p>
     <w:p>
       <w:pPr>
         <w:ind w:left="720"/>
       </w:pPr>
       <w:r>
-        <w:t>FR-0</w:t>
-      </w:r>
-      <w:r>
-        <w:t>4</w:t>
-      </w:r>
-      <w:r>
-        <w:t xml:space="preserve">: When a player is converted, the system shall broadcast the updated status </w:t>
-      </w:r>
-      <w:r>
-        <w:tab/>
-        <w:t xml:space="preserve">to all connected players </w:t>
+        <w:t>FR-: When the user selects the “Info” button, the system shall display an</w:t>
+      </w:r>
+      <w:r>
+        <w:t xml:space="preserve"> </w:t>
+      </w:r>
+      <w:r>
+        <w:t>informational modal overlay.</w:t>
       </w:r>
     </w:p>
     <w:p>
@@ -505,17 +350,7 @@
         <w:ind w:left="720"/>
       </w:pPr>
       <w:r>
-        <w:t>FR-0</w:t>
-      </w:r>
-      <w:r>
-        <w:t>5</w:t>
-      </w:r>
-      <w:r>
-        <w:t xml:space="preserve">: When a match ends, the system shall determine the winning team based on </w:t>
-      </w:r>
-      <w:r>
-        <w:tab/>
-        <w:t xml:space="preserve">number of players per team </w:t>
+        <w:t>FR-: When the user selects the “Settings” button, the system shall display the settings modal overlay.</w:t>
       </w:r>
     </w:p>
     <w:p>
@@ -523,17 +358,7 @@
         <w:ind w:left="720"/>
       </w:pPr>
       <w:r>
-        <w:t>FR-0</w:t>
-      </w:r>
-      <w:r>
-        <w:t>6</w:t>
-      </w:r>
-      <w:r>
-        <w:t xml:space="preserve">: When a player collects a power-up, the system shall apply the corresponding </w:t>
-      </w:r>
-      <w:r>
-        <w:tab/>
-        <w:t xml:space="preserve">effect </w:t>
+        <w:t>FR-: When the user selects the “Start” button, the system shall transition from the main menu to the waiting lobby scene.</w:t>
       </w:r>
     </w:p>
     <w:p>
@@ -541,13 +366,15 @@
         <w:ind w:left="720"/>
       </w:pPr>
       <w:r>
-        <w:t>FR-0</w:t>
-      </w:r>
-      <w:r>
-        <w:t>7</w:t>
-      </w:r>
-      <w:r>
-        <w:t xml:space="preserve">: When the user presses directional input, the system </w:t>
+        <w:t xml:space="preserve">FR-: When a player joins a lobby, the system shall assign them a unique player ID and initial team state </w:t>
+      </w:r>
+    </w:p>
+    <w:p>
+      <w:pPr>
+        <w:ind w:left="720"/>
+      </w:pPr>
+      <w:r>
+        <w:t xml:space="preserve">FR-: When the user presses directional input, the system </w:t>
       </w:r>
       <w:proofErr w:type="gramStart"/>
       <w:r>
@@ -555,10 +382,12 @@
       </w:r>
       <w:proofErr w:type="gramEnd"/>
       <w:r>
-        <w:t xml:space="preserve"> update player </w:t>
-      </w:r>
-      <w:r>
-        <w:tab/>
+        <w:t xml:space="preserve"> update player</w:t>
+      </w:r>
+      <w:r>
+        <w:t xml:space="preserve"> </w:t>
+      </w:r>
+      <w:r>
         <w:t xml:space="preserve">position on the client and synchronize movement via WebSocket updates. </w:t>
       </w:r>
     </w:p>
@@ -567,25 +396,12 @@
         <w:ind w:left="720"/>
       </w:pPr>
       <w:r>
-        <w:t>FR-</w:t>
-      </w:r>
-      <w:r>
-        <w:t>08</w:t>
-      </w:r>
-      <w:r>
-        <w:t xml:space="preserve">: When movement updates are received from the server, the </w:t>
-      </w:r>
-      <w:r>
-        <w:tab/>
-      </w:r>
-      <w:r>
-        <w:tab/>
-      </w:r>
-      <w:r>
-        <w:tab/>
-      </w:r>
-      <w:r>
-        <w:tab/>
+        <w:t>FR-: When movement updates are received from the server, the</w:t>
+      </w:r>
+      <w:r>
+        <w:t xml:space="preserve"> </w:t>
+      </w:r>
+      <w:r>
         <w:t xml:space="preserve">client shall render updated positions immediately. </w:t>
       </w:r>
     </w:p>
@@ -594,12 +410,41 @@
         <w:ind w:left="720"/>
       </w:pPr>
       <w:r>
-        <w:t xml:space="preserve">FR-09: When a player collects a power-up, the system shall apply the corresponding </w:t>
-      </w:r>
-      <w:r>
-        <w:tab/>
-        <w:t>effect</w:t>
-      </w:r>
+        <w:t xml:space="preserve">FR-: When a player collects a power-up, the system shall apply the corresponding effect </w:t>
+      </w:r>
+    </w:p>
+    <w:p>
+      <w:pPr>
+        <w:ind w:left="720"/>
+      </w:pPr>
+      <w:r>
+        <w:t>FR</w:t>
+      </w:r>
+      <w:r>
+        <w:t>-:</w:t>
+      </w:r>
+      <w:r>
+        <w:t xml:space="preserve"> When a player is converted, the system shall broadcast the updated status to all connected players </w:t>
+      </w:r>
+    </w:p>
+    <w:p>
+      <w:pPr>
+        <w:ind w:left="720"/>
+      </w:pPr>
+      <w:r>
+        <w:t>FR</w:t>
+      </w:r>
+      <w:r>
+        <w:t>-:</w:t>
+      </w:r>
+      <w:r>
+        <w:t xml:space="preserve"> When a match ends, the system shall determine the winning team based on number of players per team </w:t>
+      </w:r>
+    </w:p>
+    <w:p>
+      <w:pPr>
+        <w:ind w:left="720"/>
+      </w:pPr>
     </w:p>
     <w:p>
       <w:pPr>
@@ -623,7 +468,7 @@
     </w:p>
     <w:p/>
     <w:sectPr>
-      <w:pgSz w:w="12240" w:h="15840"/>
+      <w:pgSz w:w="12240" w:h="15840" w:orient="portrait"/>
       <w:pgMar w:top="1440" w:right="1440" w:bottom="1440" w:left="1440" w:header="720" w:footer="720" w:gutter="0"/>
       <w:cols w:space="720"/>
       <w:docGrid w:linePitch="360"/>
@@ -647,7 +492,7 @@
         <w:ind w:left="1800" w:hanging="360"/>
       </w:pPr>
       <w:rPr>
-        <w:rFonts w:ascii="Symbol" w:hAnsi="Symbol" w:hint="default"/>
+        <w:rFonts w:hint="default" w:ascii="Symbol" w:hAnsi="Symbol"/>
       </w:rPr>
     </w:lvl>
     <w:lvl w:ilvl="1" w:tplc="736A265A">
@@ -659,7 +504,7 @@
         <w:ind w:left="2520" w:hanging="360"/>
       </w:pPr>
       <w:rPr>
-        <w:rFonts w:ascii="Courier New" w:hAnsi="Courier New" w:hint="default"/>
+        <w:rFonts w:hint="default" w:ascii="Courier New" w:hAnsi="Courier New"/>
       </w:rPr>
     </w:lvl>
     <w:lvl w:ilvl="2" w:tplc="A1F831E4">
@@ -671,7 +516,7 @@
         <w:ind w:left="3240" w:hanging="360"/>
       </w:pPr>
       <w:rPr>
-        <w:rFonts w:ascii="Wingdings" w:hAnsi="Wingdings" w:hint="default"/>
+        <w:rFonts w:hint="default" w:ascii="Wingdings" w:hAnsi="Wingdings"/>
       </w:rPr>
     </w:lvl>
     <w:lvl w:ilvl="3" w:tplc="4B320B60">
@@ -683,7 +528,7 @@
         <w:ind w:left="3960" w:hanging="360"/>
       </w:pPr>
       <w:rPr>
-        <w:rFonts w:ascii="Symbol" w:hAnsi="Symbol" w:hint="default"/>
+        <w:rFonts w:hint="default" w:ascii="Symbol" w:hAnsi="Symbol"/>
       </w:rPr>
     </w:lvl>
     <w:lvl w:ilvl="4" w:tplc="BDB8BC24">
@@ -695,7 +540,7 @@
         <w:ind w:left="4680" w:hanging="360"/>
       </w:pPr>
       <w:rPr>
-        <w:rFonts w:ascii="Courier New" w:hAnsi="Courier New" w:hint="default"/>
+        <w:rFonts w:hint="default" w:ascii="Courier New" w:hAnsi="Courier New"/>
       </w:rPr>
     </w:lvl>
     <w:lvl w:ilvl="5" w:tplc="5360FB88">
@@ -707,7 +552,7 @@
         <w:ind w:left="5400" w:hanging="360"/>
       </w:pPr>
       <w:rPr>
-        <w:rFonts w:ascii="Wingdings" w:hAnsi="Wingdings" w:hint="default"/>
+        <w:rFonts w:hint="default" w:ascii="Wingdings" w:hAnsi="Wingdings"/>
       </w:rPr>
     </w:lvl>
     <w:lvl w:ilvl="6" w:tplc="36D0487A">
@@ -719,7 +564,7 @@
         <w:ind w:left="6120" w:hanging="360"/>
       </w:pPr>
       <w:rPr>
-        <w:rFonts w:ascii="Symbol" w:hAnsi="Symbol" w:hint="default"/>
+        <w:rFonts w:hint="default" w:ascii="Symbol" w:hAnsi="Symbol"/>
       </w:rPr>
     </w:lvl>
     <w:lvl w:ilvl="7" w:tplc="F664F332">
@@ -731,7 +576,7 @@
         <w:ind w:left="6840" w:hanging="360"/>
       </w:pPr>
       <w:rPr>
-        <w:rFonts w:ascii="Courier New" w:hAnsi="Courier New" w:hint="default"/>
+        <w:rFonts w:hint="default" w:ascii="Courier New" w:hAnsi="Courier New"/>
       </w:rPr>
     </w:lvl>
     <w:lvl w:ilvl="8" w:tplc="6CA67B0A">
@@ -743,7 +588,7 @@
         <w:ind w:left="7560" w:hanging="360"/>
       </w:pPr>
       <w:rPr>
-        <w:rFonts w:ascii="Wingdings" w:hAnsi="Wingdings" w:hint="default"/>
+        <w:rFonts w:hint="default" w:ascii="Wingdings" w:hAnsi="Wingdings"/>
       </w:rPr>
     </w:lvl>
   </w:abstractNum>
@@ -760,7 +605,7 @@
         <w:ind w:left="1080" w:hanging="360"/>
       </w:pPr>
       <w:rPr>
-        <w:rFonts w:ascii="Symbol" w:hAnsi="Symbol" w:hint="default"/>
+        <w:rFonts w:hint="default" w:ascii="Symbol" w:hAnsi="Symbol"/>
       </w:rPr>
     </w:lvl>
     <w:lvl w:ilvl="1" w:tplc="8346A048">
@@ -772,7 +617,7 @@
         <w:ind w:left="1800" w:hanging="360"/>
       </w:pPr>
       <w:rPr>
-        <w:rFonts w:ascii="Courier New" w:hAnsi="Courier New" w:hint="default"/>
+        <w:rFonts w:hint="default" w:ascii="Courier New" w:hAnsi="Courier New"/>
       </w:rPr>
     </w:lvl>
     <w:lvl w:ilvl="2" w:tplc="795E779C">
@@ -784,7 +629,7 @@
         <w:ind w:left="2520" w:hanging="360"/>
       </w:pPr>
       <w:rPr>
-        <w:rFonts w:ascii="Wingdings" w:hAnsi="Wingdings" w:hint="default"/>
+        <w:rFonts w:hint="default" w:ascii="Wingdings" w:hAnsi="Wingdings"/>
       </w:rPr>
     </w:lvl>
     <w:lvl w:ilvl="3" w:tplc="400A44E6">
@@ -796,7 +641,7 @@
         <w:ind w:left="3240" w:hanging="360"/>
       </w:pPr>
       <w:rPr>
-        <w:rFonts w:ascii="Symbol" w:hAnsi="Symbol" w:hint="default"/>
+        <w:rFonts w:hint="default" w:ascii="Symbol" w:hAnsi="Symbol"/>
       </w:rPr>
     </w:lvl>
     <w:lvl w:ilvl="4" w:tplc="924CFAA0">
@@ -808,7 +653,7 @@
         <w:ind w:left="3960" w:hanging="360"/>
       </w:pPr>
       <w:rPr>
-        <w:rFonts w:ascii="Courier New" w:hAnsi="Courier New" w:hint="default"/>
+        <w:rFonts w:hint="default" w:ascii="Courier New" w:hAnsi="Courier New"/>
       </w:rPr>
     </w:lvl>
     <w:lvl w:ilvl="5" w:tplc="90FA2952">
@@ -820,7 +665,7 @@
         <w:ind w:left="4680" w:hanging="360"/>
       </w:pPr>
       <w:rPr>
-        <w:rFonts w:ascii="Wingdings" w:hAnsi="Wingdings" w:hint="default"/>
+        <w:rFonts w:hint="default" w:ascii="Wingdings" w:hAnsi="Wingdings"/>
       </w:rPr>
     </w:lvl>
     <w:lvl w:ilvl="6" w:tplc="7660BB1A">
@@ -832,7 +677,7 @@
         <w:ind w:left="5400" w:hanging="360"/>
       </w:pPr>
       <w:rPr>
-        <w:rFonts w:ascii="Symbol" w:hAnsi="Symbol" w:hint="default"/>
+        <w:rFonts w:hint="default" w:ascii="Symbol" w:hAnsi="Symbol"/>
       </w:rPr>
     </w:lvl>
     <w:lvl w:ilvl="7" w:tplc="78140494">
@@ -844,7 +689,7 @@
         <w:ind w:left="6120" w:hanging="360"/>
       </w:pPr>
       <w:rPr>
-        <w:rFonts w:ascii="Courier New" w:hAnsi="Courier New" w:hint="default"/>
+        <w:rFonts w:hint="default" w:ascii="Courier New" w:hAnsi="Courier New"/>
       </w:rPr>
     </w:lvl>
     <w:lvl w:ilvl="8" w:tplc="1496258A">
@@ -856,7 +701,7 @@
         <w:ind w:left="6840" w:hanging="360"/>
       </w:pPr>
       <w:rPr>
-        <w:rFonts w:ascii="Wingdings" w:hAnsi="Wingdings" w:hint="default"/>
+        <w:rFonts w:hint="default" w:ascii="Wingdings" w:hAnsi="Wingdings"/>
       </w:rPr>
     </w:lvl>
   </w:abstractNum>
@@ -873,7 +718,7 @@
         <w:ind w:left="1440" w:hanging="360"/>
       </w:pPr>
       <w:rPr>
-        <w:rFonts w:ascii="Symbol" w:hAnsi="Symbol" w:hint="default"/>
+        <w:rFonts w:hint="default" w:ascii="Symbol" w:hAnsi="Symbol"/>
       </w:rPr>
     </w:lvl>
     <w:lvl w:ilvl="1" w:tplc="13CE319A">
@@ -885,7 +730,7 @@
         <w:ind w:left="2160" w:hanging="360"/>
       </w:pPr>
       <w:rPr>
-        <w:rFonts w:ascii="Courier New" w:hAnsi="Courier New" w:hint="default"/>
+        <w:rFonts w:hint="default" w:ascii="Courier New" w:hAnsi="Courier New"/>
       </w:rPr>
     </w:lvl>
     <w:lvl w:ilvl="2" w:tplc="603AF590">
@@ -897,7 +742,7 @@
         <w:ind w:left="2880" w:hanging="360"/>
       </w:pPr>
       <w:rPr>
-        <w:rFonts w:ascii="Wingdings" w:hAnsi="Wingdings" w:hint="default"/>
+        <w:rFonts w:hint="default" w:ascii="Wingdings" w:hAnsi="Wingdings"/>
       </w:rPr>
     </w:lvl>
     <w:lvl w:ilvl="3" w:tplc="2ED87DA8">
@@ -909,7 +754,7 @@
         <w:ind w:left="3600" w:hanging="360"/>
       </w:pPr>
       <w:rPr>
-        <w:rFonts w:ascii="Symbol" w:hAnsi="Symbol" w:hint="default"/>
+        <w:rFonts w:hint="default" w:ascii="Symbol" w:hAnsi="Symbol"/>
       </w:rPr>
     </w:lvl>
     <w:lvl w:ilvl="4" w:tplc="F9DE5386">
@@ -921,7 +766,7 @@
         <w:ind w:left="4320" w:hanging="360"/>
       </w:pPr>
       <w:rPr>
-        <w:rFonts w:ascii="Courier New" w:hAnsi="Courier New" w:hint="default"/>
+        <w:rFonts w:hint="default" w:ascii="Courier New" w:hAnsi="Courier New"/>
       </w:rPr>
     </w:lvl>
     <w:lvl w:ilvl="5" w:tplc="BFC8D882">
@@ -933,7 +778,7 @@
         <w:ind w:left="5040" w:hanging="360"/>
       </w:pPr>
       <w:rPr>
-        <w:rFonts w:ascii="Wingdings" w:hAnsi="Wingdings" w:hint="default"/>
+        <w:rFonts w:hint="default" w:ascii="Wingdings" w:hAnsi="Wingdings"/>
       </w:rPr>
     </w:lvl>
     <w:lvl w:ilvl="6" w:tplc="70FABDC4">
@@ -945,7 +790,7 @@
         <w:ind w:left="5760" w:hanging="360"/>
       </w:pPr>
       <w:rPr>
-        <w:rFonts w:ascii="Symbol" w:hAnsi="Symbol" w:hint="default"/>
+        <w:rFonts w:hint="default" w:ascii="Symbol" w:hAnsi="Symbol"/>
       </w:rPr>
     </w:lvl>
     <w:lvl w:ilvl="7" w:tplc="A472492A">
@@ -957,7 +802,7 @@
         <w:ind w:left="6480" w:hanging="360"/>
       </w:pPr>
       <w:rPr>
-        <w:rFonts w:ascii="Courier New" w:hAnsi="Courier New" w:hint="default"/>
+        <w:rFonts w:hint="default" w:ascii="Courier New" w:hAnsi="Courier New"/>
       </w:rPr>
     </w:lvl>
     <w:lvl w:ilvl="8" w:tplc="3BF0EAC0">
@@ -969,7 +814,7 @@
         <w:ind w:left="7200" w:hanging="360"/>
       </w:pPr>
       <w:rPr>
-        <w:rFonts w:ascii="Wingdings" w:hAnsi="Wingdings" w:hint="default"/>
+        <w:rFonts w:hint="default" w:ascii="Wingdings" w:hAnsi="Wingdings"/>
       </w:rPr>
     </w:lvl>
   </w:abstractNum>
@@ -1072,7 +917,7 @@
         <w:ind w:left="720" w:hanging="360"/>
       </w:pPr>
       <w:rPr>
-        <w:rFonts w:ascii="Symbol" w:hAnsi="Symbol" w:hint="default"/>
+        <w:rFonts w:hint="default" w:ascii="Symbol" w:hAnsi="Symbol"/>
       </w:rPr>
     </w:lvl>
     <w:lvl w:ilvl="1" w:tplc="36F0220E">
@@ -1084,7 +929,7 @@
         <w:ind w:left="1440" w:hanging="360"/>
       </w:pPr>
       <w:rPr>
-        <w:rFonts w:ascii="Courier New" w:hAnsi="Courier New" w:hint="default"/>
+        <w:rFonts w:hint="default" w:ascii="Courier New" w:hAnsi="Courier New"/>
       </w:rPr>
     </w:lvl>
     <w:lvl w:ilvl="2" w:tplc="FDD20EAE">
@@ -1096,7 +941,7 @@
         <w:ind w:left="2160" w:hanging="360"/>
       </w:pPr>
       <w:rPr>
-        <w:rFonts w:ascii="Wingdings" w:hAnsi="Wingdings" w:hint="default"/>
+        <w:rFonts w:hint="default" w:ascii="Wingdings" w:hAnsi="Wingdings"/>
       </w:rPr>
     </w:lvl>
     <w:lvl w:ilvl="3" w:tplc="8D1E2FFE">
@@ -1108,7 +953,7 @@
         <w:ind w:left="2880" w:hanging="360"/>
       </w:pPr>
       <w:rPr>
-        <w:rFonts w:ascii="Symbol" w:hAnsi="Symbol" w:hint="default"/>
+        <w:rFonts w:hint="default" w:ascii="Symbol" w:hAnsi="Symbol"/>
       </w:rPr>
     </w:lvl>
     <w:lvl w:ilvl="4" w:tplc="88C43230">
@@ -1120,7 +965,7 @@
         <w:ind w:left="3600" w:hanging="360"/>
       </w:pPr>
       <w:rPr>
-        <w:rFonts w:ascii="Courier New" w:hAnsi="Courier New" w:hint="default"/>
+        <w:rFonts w:hint="default" w:ascii="Courier New" w:hAnsi="Courier New"/>
       </w:rPr>
     </w:lvl>
     <w:lvl w:ilvl="5" w:tplc="A7725514">
@@ -1132,7 +977,7 @@
         <w:ind w:left="4320" w:hanging="360"/>
       </w:pPr>
       <w:rPr>
-        <w:rFonts w:ascii="Wingdings" w:hAnsi="Wingdings" w:hint="default"/>
+        <w:rFonts w:hint="default" w:ascii="Wingdings" w:hAnsi="Wingdings"/>
       </w:rPr>
     </w:lvl>
     <w:lvl w:ilvl="6" w:tplc="79B0DC10">
@@ -1144,7 +989,7 @@
         <w:ind w:left="5040" w:hanging="360"/>
       </w:pPr>
       <w:rPr>
-        <w:rFonts w:ascii="Symbol" w:hAnsi="Symbol" w:hint="default"/>
+        <w:rFonts w:hint="default" w:ascii="Symbol" w:hAnsi="Symbol"/>
       </w:rPr>
     </w:lvl>
     <w:lvl w:ilvl="7" w:tplc="F80A4DB2">
@@ -1156,7 +1001,7 @@
         <w:ind w:left="5760" w:hanging="360"/>
       </w:pPr>
       <w:rPr>
-        <w:rFonts w:ascii="Courier New" w:hAnsi="Courier New" w:hint="default"/>
+        <w:rFonts w:hint="default" w:ascii="Courier New" w:hAnsi="Courier New"/>
       </w:rPr>
     </w:lvl>
     <w:lvl w:ilvl="8" w:tplc="3BA47C1E">
@@ -1168,7 +1013,7 @@
         <w:ind w:left="6480" w:hanging="360"/>
       </w:pPr>
       <w:rPr>
-        <w:rFonts w:ascii="Wingdings" w:hAnsi="Wingdings" w:hint="default"/>
+        <w:rFonts w:hint="default" w:ascii="Wingdings" w:hAnsi="Wingdings"/>
       </w:rPr>
     </w:lvl>
   </w:abstractNum>
@@ -1283,11 +1128,11 @@
 </file>
 
 <file path=word/styles.xml><?xml version="1.0" encoding="utf-8"?>
-<w:styles xmlns:mc="http://schemas.openxmlformats.org/markup-compatibility/2006" xmlns:r="http://schemas.openxmlformats.org/officeDocument/2006/relationships" xmlns:w="http://schemas.openxmlformats.org/wordprocessingml/2006/main" xmlns:w14="http://schemas.microsoft.com/office/word/2010/wordml" xmlns:w15="http://schemas.microsoft.com/office/word/2012/wordml" xmlns:w16cex="http://schemas.microsoft.com/office/word/2018/wordml/cex" xmlns:w16cid="http://schemas.microsoft.com/office/word/2016/wordml/cid" xmlns:w16="http://schemas.microsoft.com/office/word/2018/wordml" xmlns:w16du="http://schemas.microsoft.com/office/word/2023/wordml/word16du" xmlns:w16sdtdh="http://schemas.microsoft.com/office/word/2020/wordml/sdtdatahash" xmlns:w16sdtfl="http://schemas.microsoft.com/office/word/2024/wordml/sdtformatlock" xmlns:w16se="http://schemas.microsoft.com/office/word/2015/wordml/symex" mc:Ignorable="w14 w15 w16se w16cid w16 w16cex w16sdtdh w16sdtfl w16du">
+<w:styles xmlns:wp14="http://schemas.microsoft.com/office/word/2010/wordprocessingDrawing" xmlns:mc="http://schemas.openxmlformats.org/markup-compatibility/2006" xmlns:r="http://schemas.openxmlformats.org/officeDocument/2006/relationships" xmlns:w="http://schemas.openxmlformats.org/wordprocessingml/2006/main" xmlns:w14="http://schemas.microsoft.com/office/word/2010/wordml" xmlns:w15="http://schemas.microsoft.com/office/word/2012/wordml" xmlns:w16cex="http://schemas.microsoft.com/office/word/2018/wordml/cex" xmlns:w16cid="http://schemas.microsoft.com/office/word/2016/wordml/cid" xmlns:w16="http://schemas.microsoft.com/office/word/2018/wordml" xmlns:w16du="http://schemas.microsoft.com/office/word/2023/wordml/word16du" xmlns:w16sdtdh="http://schemas.microsoft.com/office/word/2020/wordml/sdtdatahash" xmlns:w16sdtfl="http://schemas.microsoft.com/office/word/2024/wordml/sdtformatlock" xmlns:w16se="http://schemas.microsoft.com/office/word/2015/wordml/symex" mc:Ignorable="w14 w15 w16se w16cid w16 w16cex w16sdtdh w16sdtfl w16du wp14">
   <w:docDefaults>
     <w:rPrDefault>
       <w:rPr>
-        <w:rFonts w:asciiTheme="minorHAnsi" w:eastAsiaTheme="minorHAnsi" w:hAnsiTheme="minorHAnsi" w:cstheme="minorBidi"/>
+        <w:rFonts w:asciiTheme="minorHAnsi" w:hAnsiTheme="minorHAnsi" w:eastAsiaTheme="minorHAnsi" w:cstheme="minorBidi"/>
         <w:kern w:val="2"/>
         <w:sz w:val="24"/>
         <w:szCs w:val="24"/>
@@ -1304,14 +1149,14 @@
   <w:latentStyles w:defLockedState="0" w:defUIPriority="99" w:defSemiHidden="0" w:defUnhideWhenUsed="0" w:defQFormat="0" w:count="376">
     <w:lsdException w:name="Normal" w:uiPriority="0" w:qFormat="1"/>
     <w:lsdException w:name="heading 1" w:uiPriority="9" w:qFormat="1"/>
-    <w:lsdException w:name="heading 2" w:semiHidden="1" w:uiPriority="9" w:unhideWhenUsed="1" w:qFormat="1"/>
-    <w:lsdException w:name="heading 3" w:semiHidden="1" w:uiPriority="9" w:unhideWhenUsed="1" w:qFormat="1"/>
-    <w:lsdException w:name="heading 4" w:semiHidden="1" w:uiPriority="9" w:unhideWhenUsed="1" w:qFormat="1"/>
-    <w:lsdException w:name="heading 5" w:semiHidden="1" w:uiPriority="9" w:unhideWhenUsed="1" w:qFormat="1"/>
-    <w:lsdException w:name="heading 6" w:semiHidden="1" w:uiPriority="9" w:unhideWhenUsed="1" w:qFormat="1"/>
-    <w:lsdException w:name="heading 7" w:semiHidden="1" w:uiPriority="9" w:unhideWhenUsed="1" w:qFormat="1"/>
-    <w:lsdException w:name="heading 8" w:semiHidden="1" w:uiPriority="9" w:unhideWhenUsed="1" w:qFormat="1"/>
-    <w:lsdException w:name="heading 9" w:semiHidden="1" w:uiPriority="9" w:unhideWhenUsed="1" w:qFormat="1"/>
+    <w:lsdException w:name="heading 2" w:uiPriority="9" w:semiHidden="1" w:unhideWhenUsed="1" w:qFormat="1"/>
+    <w:lsdException w:name="heading 3" w:uiPriority="9" w:semiHidden="1" w:unhideWhenUsed="1" w:qFormat="1"/>
+    <w:lsdException w:name="heading 4" w:uiPriority="9" w:semiHidden="1" w:unhideWhenUsed="1" w:qFormat="1"/>
+    <w:lsdException w:name="heading 5" w:uiPriority="9" w:semiHidden="1" w:unhideWhenUsed="1" w:qFormat="1"/>
+    <w:lsdException w:name="heading 6" w:uiPriority="9" w:semiHidden="1" w:unhideWhenUsed="1" w:qFormat="1"/>
+    <w:lsdException w:name="heading 7" w:uiPriority="9" w:semiHidden="1" w:unhideWhenUsed="1" w:qFormat="1"/>
+    <w:lsdException w:name="heading 8" w:uiPriority="9" w:semiHidden="1" w:unhideWhenUsed="1" w:qFormat="1"/>
+    <w:lsdException w:name="heading 9" w:uiPriority="9" w:semiHidden="1" w:unhideWhenUsed="1" w:qFormat="1"/>
     <w:lsdException w:name="index 1" w:semiHidden="1" w:unhideWhenUsed="1"/>
     <w:lsdException w:name="index 2" w:semiHidden="1" w:unhideWhenUsed="1"/>
     <w:lsdException w:name="index 3" w:semiHidden="1" w:unhideWhenUsed="1"/>
@@ -1321,22 +1166,22 @@
     <w:lsdException w:name="index 7" w:semiHidden="1" w:unhideWhenUsed="1"/>
     <w:lsdException w:name="index 8" w:semiHidden="1" w:unhideWhenUsed="1"/>
     <w:lsdException w:name="index 9" w:semiHidden="1" w:unhideWhenUsed="1"/>
-    <w:lsdException w:name="toc 1" w:semiHidden="1" w:uiPriority="39" w:unhideWhenUsed="1"/>
-    <w:lsdException w:name="toc 2" w:semiHidden="1" w:uiPriority="39" w:unhideWhenUsed="1"/>
-    <w:lsdException w:name="toc 3" w:semiHidden="1" w:uiPriority="39" w:unhideWhenUsed="1"/>
-    <w:lsdException w:name="toc 4" w:semiHidden="1" w:uiPriority="39" w:unhideWhenUsed="1"/>
-    <w:lsdException w:name="toc 5" w:semiHidden="1" w:uiPriority="39" w:unhideWhenUsed="1"/>
-    <w:lsdException w:name="toc 6" w:semiHidden="1" w:uiPriority="39" w:unhideWhenUsed="1"/>
-    <w:lsdException w:name="toc 7" w:semiHidden="1" w:uiPriority="39" w:unhideWhenUsed="1"/>
-    <w:lsdException w:name="toc 8" w:semiHidden="1" w:uiPriority="39" w:unhideWhenUsed="1"/>
-    <w:lsdException w:name="toc 9" w:semiHidden="1" w:uiPriority="39" w:unhideWhenUsed="1"/>
+    <w:lsdException w:name="toc 1" w:uiPriority="39" w:semiHidden="1" w:unhideWhenUsed="1"/>
+    <w:lsdException w:name="toc 2" w:uiPriority="39" w:semiHidden="1" w:unhideWhenUsed="1"/>
+    <w:lsdException w:name="toc 3" w:uiPriority="39" w:semiHidden="1" w:unhideWhenUsed="1"/>
+    <w:lsdException w:name="toc 4" w:uiPriority="39" w:semiHidden="1" w:unhideWhenUsed="1"/>
+    <w:lsdException w:name="toc 5" w:uiPriority="39" w:semiHidden="1" w:unhideWhenUsed="1"/>
+    <w:lsdException w:name="toc 6" w:uiPriority="39" w:semiHidden="1" w:unhideWhenUsed="1"/>
+    <w:lsdException w:name="toc 7" w:uiPriority="39" w:semiHidden="1" w:unhideWhenUsed="1"/>
+    <w:lsdException w:name="toc 8" w:uiPriority="39" w:semiHidden="1" w:unhideWhenUsed="1"/>
+    <w:lsdException w:name="toc 9" w:uiPriority="39" w:semiHidden="1" w:unhideWhenUsed="1"/>
     <w:lsdException w:name="Normal Indent" w:semiHidden="1" w:unhideWhenUsed="1"/>
     <w:lsdException w:name="footnote text" w:semiHidden="1" w:unhideWhenUsed="1"/>
     <w:lsdException w:name="annotation text" w:semiHidden="1" w:unhideWhenUsed="1"/>
     <w:lsdException w:name="header" w:semiHidden="1" w:unhideWhenUsed="1"/>
     <w:lsdException w:name="footer" w:semiHidden="1" w:unhideWhenUsed="1"/>
     <w:lsdException w:name="index heading" w:semiHidden="1" w:unhideWhenUsed="1"/>
-    <w:lsdException w:name="caption" w:semiHidden="1" w:uiPriority="35" w:unhideWhenUsed="1" w:qFormat="1"/>
+    <w:lsdException w:name="caption" w:uiPriority="35" w:semiHidden="1" w:unhideWhenUsed="1" w:qFormat="1"/>
     <w:lsdException w:name="table of figures" w:semiHidden="1" w:unhideWhenUsed="1"/>
     <w:lsdException w:name="envelope address" w:semiHidden="1" w:unhideWhenUsed="1"/>
     <w:lsdException w:name="envelope return" w:semiHidden="1" w:unhideWhenUsed="1"/>
@@ -1367,7 +1212,7 @@
     <w:lsdException w:name="Title" w:uiPriority="10" w:qFormat="1"/>
     <w:lsdException w:name="Closing" w:semiHidden="1" w:unhideWhenUsed="1"/>
     <w:lsdException w:name="Signature" w:semiHidden="1" w:unhideWhenUsed="1"/>
-    <w:lsdException w:name="Default Paragraph Font" w:semiHidden="1" w:uiPriority="1" w:unhideWhenUsed="1"/>
+    <w:lsdException w:name="Default Paragraph Font" w:uiPriority="1" w:semiHidden="1" w:unhideWhenUsed="1"/>
     <w:lsdException w:name="Body Text" w:semiHidden="1" w:unhideWhenUsed="1"/>
     <w:lsdException w:name="Body Text Indent" w:semiHidden="1" w:unhideWhenUsed="1"/>
     <w:lsdException w:name="List Continue" w:semiHidden="1" w:unhideWhenUsed="1"/>
@@ -1567,8 +1412,8 @@
     <w:lsdException w:name="Subtle Reference" w:uiPriority="31" w:qFormat="1"/>
     <w:lsdException w:name="Intense Reference" w:uiPriority="32" w:qFormat="1"/>
     <w:lsdException w:name="Book Title" w:uiPriority="33" w:qFormat="1"/>
-    <w:lsdException w:name="Bibliography" w:semiHidden="1" w:uiPriority="37" w:unhideWhenUsed="1"/>
-    <w:lsdException w:name="TOC Heading" w:semiHidden="1" w:uiPriority="39" w:unhideWhenUsed="1" w:qFormat="1"/>
+    <w:lsdException w:name="Bibliography" w:uiPriority="37" w:semiHidden="1" w:unhideWhenUsed="1"/>
+    <w:lsdException w:name="TOC Heading" w:uiPriority="39" w:semiHidden="1" w:unhideWhenUsed="1" w:qFormat="1"/>
     <w:lsdException w:name="Plain Table 1" w:uiPriority="41"/>
     <w:lsdException w:name="Plain Table 2" w:uiPriority="42"/>
     <w:lsdException w:name="Plain Table 3" w:uiPriority="43"/>
@@ -1679,7 +1524,7 @@
     <w:lsdException w:name="Unresolved Mention" w:semiHidden="1" w:unhideWhenUsed="1"/>
     <w:lsdException w:name="Smart Link" w:semiHidden="1" w:unhideWhenUsed="1"/>
   </w:latentStyles>
-  <w:style w:type="paragraph" w:default="1" w:styleId="Normal">
+  <w:style w:type="paragraph" w:styleId="Normal" w:default="1">
     <w:name w:val="Normal"/>
     <w:qFormat/>
     <w:rsid w:val="00EE09AE"/>
@@ -1699,7 +1544,7 @@
       <w:outlineLvl w:val="0"/>
     </w:pPr>
     <w:rPr>
-      <w:rFonts w:asciiTheme="majorHAnsi" w:eastAsiaTheme="majorEastAsia" w:hAnsiTheme="majorHAnsi" w:cstheme="majorBidi"/>
+      <w:rFonts w:asciiTheme="majorHAnsi" w:hAnsiTheme="majorHAnsi" w:eastAsiaTheme="majorEastAsia" w:cstheme="majorBidi"/>
       <w:color w:val="0F4761" w:themeColor="accent1" w:themeShade="BF"/>
       <w:sz w:val="40"/>
       <w:szCs w:val="40"/>
@@ -1722,7 +1567,7 @@
       <w:outlineLvl w:val="1"/>
     </w:pPr>
     <w:rPr>
-      <w:rFonts w:asciiTheme="majorHAnsi" w:eastAsiaTheme="majorEastAsia" w:hAnsiTheme="majorHAnsi" w:cstheme="majorBidi"/>
+      <w:rFonts w:asciiTheme="majorHAnsi" w:hAnsiTheme="majorHAnsi" w:eastAsiaTheme="majorEastAsia" w:cstheme="majorBidi"/>
       <w:color w:val="0F4761" w:themeColor="accent1" w:themeShade="BF"/>
       <w:sz w:val="32"/>
       <w:szCs w:val="32"/>
@@ -1883,13 +1728,12 @@
       <w:color w:val="272727" w:themeColor="text1" w:themeTint="D8"/>
     </w:rPr>
   </w:style>
-  <w:style w:type="character" w:default="1" w:styleId="DefaultParagraphFont">
+  <w:style w:type="character" w:styleId="DefaultParagraphFont" w:default="1">
     <w:name w:val="Default Paragraph Font"/>
     <w:uiPriority w:val="1"/>
-    <w:semiHidden/>
     <w:unhideWhenUsed/>
   </w:style>
-  <w:style w:type="table" w:default="1" w:styleId="TableNormal">
+  <w:style w:type="table" w:styleId="TableNormal" w:default="1">
     <w:name w:val="Normal Table"/>
     <w:uiPriority w:val="99"/>
     <w:semiHidden/>
@@ -1904,26 +1748,26 @@
       </w:tblCellMar>
     </w:tblPr>
   </w:style>
-  <w:style w:type="numbering" w:default="1" w:styleId="NoList">
+  <w:style w:type="numbering" w:styleId="NoList" w:default="1">
     <w:name w:val="No List"/>
     <w:uiPriority w:val="99"/>
     <w:semiHidden/>
     <w:unhideWhenUsed/>
   </w:style>
-  <w:style w:type="character" w:customStyle="1" w:styleId="Heading1Char">
+  <w:style w:type="character" w:styleId="Heading1Char" w:customStyle="1">
     <w:name w:val="Heading 1 Char"/>
     <w:basedOn w:val="DefaultParagraphFont"/>
     <w:link w:val="Heading1"/>
     <w:uiPriority w:val="9"/>
     <w:rsid w:val="00A129E7"/>
     <w:rPr>
-      <w:rFonts w:asciiTheme="majorHAnsi" w:eastAsiaTheme="majorEastAsia" w:hAnsiTheme="majorHAnsi" w:cstheme="majorBidi"/>
+      <w:rFonts w:asciiTheme="majorHAnsi" w:hAnsiTheme="majorHAnsi" w:eastAsiaTheme="majorEastAsia" w:cstheme="majorBidi"/>
       <w:color w:val="0F4761" w:themeColor="accent1" w:themeShade="BF"/>
       <w:sz w:val="40"/>
       <w:szCs w:val="40"/>
     </w:rPr>
   </w:style>
-  <w:style w:type="character" w:customStyle="1" w:styleId="Heading2Char">
+  <w:style w:type="character" w:styleId="Heading2Char" w:customStyle="1">
     <w:name w:val="Heading 2 Char"/>
     <w:basedOn w:val="DefaultParagraphFont"/>
     <w:link w:val="Heading2"/>
@@ -1931,13 +1775,13 @@
     <w:semiHidden/>
     <w:rsid w:val="00A129E7"/>
     <w:rPr>
-      <w:rFonts w:asciiTheme="majorHAnsi" w:eastAsiaTheme="majorEastAsia" w:hAnsiTheme="majorHAnsi" w:cstheme="majorBidi"/>
+      <w:rFonts w:asciiTheme="majorHAnsi" w:hAnsiTheme="majorHAnsi" w:eastAsiaTheme="majorEastAsia" w:cstheme="majorBidi"/>
       <w:color w:val="0F4761" w:themeColor="accent1" w:themeShade="BF"/>
       <w:sz w:val="32"/>
       <w:szCs w:val="32"/>
     </w:rPr>
   </w:style>
-  <w:style w:type="character" w:customStyle="1" w:styleId="Heading3Char">
+  <w:style w:type="character" w:styleId="Heading3Char" w:customStyle="1">
     <w:name w:val="Heading 3 Char"/>
     <w:basedOn w:val="DefaultParagraphFont"/>
     <w:link w:val="Heading3"/>
@@ -1951,7 +1795,7 @@
       <w:szCs w:val="28"/>
     </w:rPr>
   </w:style>
-  <w:style w:type="character" w:customStyle="1" w:styleId="Heading4Char">
+  <w:style w:type="character" w:styleId="Heading4Char" w:customStyle="1">
     <w:name w:val="Heading 4 Char"/>
     <w:basedOn w:val="DefaultParagraphFont"/>
     <w:link w:val="Heading4"/>
@@ -1965,7 +1809,7 @@
       <w:color w:val="0F4761" w:themeColor="accent1" w:themeShade="BF"/>
     </w:rPr>
   </w:style>
-  <w:style w:type="character" w:customStyle="1" w:styleId="Heading5Char">
+  <w:style w:type="character" w:styleId="Heading5Char" w:customStyle="1">
     <w:name w:val="Heading 5 Char"/>
     <w:basedOn w:val="DefaultParagraphFont"/>
     <w:link w:val="Heading5"/>
@@ -1977,7 +1821,7 @@
       <w:color w:val="0F4761" w:themeColor="accent1" w:themeShade="BF"/>
     </w:rPr>
   </w:style>
-  <w:style w:type="character" w:customStyle="1" w:styleId="Heading6Char">
+  <w:style w:type="character" w:styleId="Heading6Char" w:customStyle="1">
     <w:name w:val="Heading 6 Char"/>
     <w:basedOn w:val="DefaultParagraphFont"/>
     <w:link w:val="Heading6"/>
@@ -1991,7 +1835,7 @@
       <w:color w:val="595959" w:themeColor="text1" w:themeTint="A6"/>
     </w:rPr>
   </w:style>
-  <w:style w:type="character" w:customStyle="1" w:styleId="Heading7Char">
+  <w:style w:type="character" w:styleId="Heading7Char" w:customStyle="1">
     <w:name w:val="Heading 7 Char"/>
     <w:basedOn w:val="DefaultParagraphFont"/>
     <w:link w:val="Heading7"/>
@@ -2003,7 +1847,7 @@
       <w:color w:val="595959" w:themeColor="text1" w:themeTint="A6"/>
     </w:rPr>
   </w:style>
-  <w:style w:type="character" w:customStyle="1" w:styleId="Heading8Char">
+  <w:style w:type="character" w:styleId="Heading8Char" w:customStyle="1">
     <w:name w:val="Heading 8 Char"/>
     <w:basedOn w:val="DefaultParagraphFont"/>
     <w:link w:val="Heading8"/>
@@ -2017,7 +1861,7 @@
       <w:color w:val="272727" w:themeColor="text1" w:themeTint="D8"/>
     </w:rPr>
   </w:style>
-  <w:style w:type="character" w:customStyle="1" w:styleId="Heading9Char">
+  <w:style w:type="character" w:styleId="Heading9Char" w:customStyle="1">
     <w:name w:val="Heading 9 Char"/>
     <w:basedOn w:val="DefaultParagraphFont"/>
     <w:link w:val="Heading9"/>
@@ -2042,21 +1886,21 @@
       <w:contextualSpacing/>
     </w:pPr>
     <w:rPr>
-      <w:rFonts w:asciiTheme="majorHAnsi" w:eastAsiaTheme="majorEastAsia" w:hAnsiTheme="majorHAnsi" w:cstheme="majorBidi"/>
+      <w:rFonts w:asciiTheme="majorHAnsi" w:hAnsiTheme="majorHAnsi" w:eastAsiaTheme="majorEastAsia" w:cstheme="majorBidi"/>
       <w:spacing w:val="-10"/>
       <w:kern w:val="28"/>
       <w:sz w:val="56"/>
       <w:szCs w:val="56"/>
     </w:rPr>
   </w:style>
-  <w:style w:type="character" w:customStyle="1" w:styleId="TitleChar">
+  <w:style w:type="character" w:styleId="TitleChar" w:customStyle="1">
     <w:name w:val="Title Char"/>
     <w:basedOn w:val="DefaultParagraphFont"/>
     <w:link w:val="Title"/>
     <w:uiPriority w:val="10"/>
     <w:rsid w:val="00A129E7"/>
     <w:rPr>
-      <w:rFonts w:asciiTheme="majorHAnsi" w:eastAsiaTheme="majorEastAsia" w:hAnsiTheme="majorHAnsi" w:cstheme="majorBidi"/>
+      <w:rFonts w:asciiTheme="majorHAnsi" w:hAnsiTheme="majorHAnsi" w:eastAsiaTheme="majorEastAsia" w:cstheme="majorBidi"/>
       <w:spacing w:val="-10"/>
       <w:kern w:val="28"/>
       <w:sz w:val="56"/>
@@ -2084,7 +1928,7 @@
       <w:szCs w:val="28"/>
     </w:rPr>
   </w:style>
-  <w:style w:type="character" w:customStyle="1" w:styleId="SubtitleChar">
+  <w:style w:type="character" w:styleId="SubtitleChar" w:customStyle="1">
     <w:name w:val="Subtitle Char"/>
     <w:basedOn w:val="DefaultParagraphFont"/>
     <w:link w:val="Subtitle"/>
@@ -2116,7 +1960,7 @@
       <w:color w:val="404040" w:themeColor="text1" w:themeTint="BF"/>
     </w:rPr>
   </w:style>
-  <w:style w:type="character" w:customStyle="1" w:styleId="QuoteChar">
+  <w:style w:type="character" w:styleId="QuoteChar" w:customStyle="1">
     <w:name w:val="Quote Char"/>
     <w:basedOn w:val="DefaultParagraphFont"/>
     <w:link w:val="Quote"/>
@@ -2161,8 +2005,8 @@
     <w:rsid w:val="00A129E7"/>
     <w:pPr>
       <w:pBdr>
-        <w:top w:val="single" w:sz="4" w:space="10" w:color="0F4761" w:themeColor="accent1" w:themeShade="BF"/>
-        <w:bottom w:val="single" w:sz="4" w:space="10" w:color="0F4761" w:themeColor="accent1" w:themeShade="BF"/>
+        <w:top w:val="single" w:color="0F4761" w:themeColor="accent1" w:themeShade="BF" w:sz="4" w:space="10"/>
+        <w:bottom w:val="single" w:color="0F4761" w:themeColor="accent1" w:themeShade="BF" w:sz="4" w:space="10"/>
       </w:pBdr>
       <w:spacing w:before="360" w:after="360"/>
       <w:ind w:left="864" w:right="864"/>
@@ -2174,7 +2018,7 @@
       <w:color w:val="0F4761" w:themeColor="accent1" w:themeShade="BF"/>
     </w:rPr>
   </w:style>
-  <w:style w:type="character" w:customStyle="1" w:styleId="IntenseQuoteChar">
+  <w:style w:type="character" w:styleId="IntenseQuoteChar" w:customStyle="1">
     <w:name w:val="Intense Quote Char"/>
     <w:basedOn w:val="DefaultParagraphFont"/>
     <w:link w:val="IntenseQuote"/>
@@ -2239,7 +2083,7 @@
 </file>
 
 <file path=word/theme/theme1.xml><?xml version="1.0" encoding="utf-8"?>
-<a:theme xmlns:a="http://schemas.openxmlformats.org/drawingml/2006/main" name="Office Theme">
+<a:theme xmlns:a="http://schemas.openxmlformats.org/drawingml/2006/main" xmlns:thm15="http://schemas.microsoft.com/office/thememl/2012/main" name="Office Theme">
   <a:themeElements>
     <a:clrScheme name="Office">
       <a:dk1>

</xml_diff>